<commit_message>
feat: add monthly indicator value tracking and aggregation rules
- Introduced IndicatorMonthlyValueDto for monthly data entries.
- Updated IndicatorResponse to include monthly values and aggregation rules.
- Enhanced IndicatorValuePointDto with computed status and months reported.
- Created AggregationRule enum to define how annual values are derived from monthly entries.
- Modified IndicatorDefinition to include aggregation rule with default value.
- Updated ReferenceService and related DTOs to handle new aggregation rules.
- Added SQL migrations for monthly aggregation and new indicator definitions.
- Implemented tests for annual value computation based on aggregation rules.
- Updated frontend API and components to support monthly value entry and display.
- Enhanced user interface for monthly breakdown and evidence document preview.
</commit_message>
<xml_diff>
--- a/PRD_SDG_ESG_Platform.docx
+++ b/PRD_SDG_ESG_Platform.docx
@@ -1984,31 +1984,31 @@
                 <w:sz w:val="19"/>
                 <w:szCs w:val="19"/>
               </w:rPr>
-              <w:t xml:space="preserve">Common [C] indicator forms</w:t>
-            </w:r>
-          </w:p>
-        </w:tc>
-        <w:tc>
-          <w:tcPr>
-            <w:tcW w:type="dxa" w:w="0"/>
-            <w:shd w:fill="FFFFFF" w:val="clear"/>
-            <w:tcMar>
-              <w:top w:type="dxa" w:w="80"/>
-              <w:left w:type="dxa" w:w="100"/>
-              <w:bottom w:type="dxa" w:w="80"/>
-              <w:right w:type="dxa" w:w="100"/>
-            </w:tcMar>
-          </w:tcPr>
-          <w:p>
-            <w:r>
-              <w:rPr>
-                <w:b w:val="false"/>
-                <w:bCs w:val="false"/>
-                <w:color w:val="222222"/>
-                <w:sz w:val="19"/>
-                <w:szCs w:val="19"/>
-              </w:rPr>
-              <w:t xml:space="preserve">Structured input for all 11 matters / ~24 sub-indicators (anti-corruption, emissions, waste, etc.)</w:t>
+              <w:t xml:space="preserve">Monthly data entry</w:t>
+            </w:r>
+          </w:p>
+        </w:tc>
+        <w:tc>
+          <w:tcPr>
+            <w:tcW w:type="dxa" w:w="0"/>
+            <w:shd w:fill="FFFFFF" w:val="clear"/>
+            <w:tcMar>
+              <w:top w:type="dxa" w:w="80"/>
+              <w:left w:type="dxa" w:w="100"/>
+              <w:bottom w:type="dxa" w:w="80"/>
+              <w:right w:type="dxa" w:w="100"/>
+            </w:tcMar>
+          </w:tcPr>
+          <w:p>
+            <w:r>
+              <w:rPr>
+                <w:b w:val="false"/>
+                <w:bCs w:val="false"/>
+                <w:color w:val="222222"/>
+                <w:sz w:val="19"/>
+                <w:szCs w:val="19"/>
+              </w:rPr>
+              <w:t xml:space="preserve">Log indicator data monthly as it becomes available, rather than pre-calculating an annual figure</w:t>
             </w:r>
           </w:p>
         </w:tc>
@@ -2058,31 +2058,31 @@
                 <w:sz w:val="19"/>
                 <w:szCs w:val="19"/>
               </w:rPr>
-              <w:t xml:space="preserve">Multi-year data table</w:t>
-            </w:r>
-          </w:p>
-        </w:tc>
-        <w:tc>
-          <w:tcPr>
-            <w:tcW w:type="dxa" w:w="0"/>
-            <w:shd w:fill="FFFFFF" w:val="clear"/>
-            <w:tcMar>
-              <w:top w:type="dxa" w:w="80"/>
-              <w:left w:type="dxa" w:w="100"/>
-              <w:bottom w:type="dxa" w:w="80"/>
-              <w:right w:type="dxa" w:w="100"/>
-            </w:tcMar>
-          </w:tcPr>
-          <w:p>
-            <w:r>
-              <w:rPr>
-                <w:b w:val="false"/>
-                <w:bCs w:val="false"/>
-                <w:color w:val="222222"/>
-                <w:sz w:val="19"/>
-                <w:szCs w:val="19"/>
-              </w:rPr>
-              <w:t xml:space="preserve">Store and display at least 3 financial years per indicator</w:t>
+              <w:t xml:space="preserve">Automatic annual aggregation</w:t>
+            </w:r>
+          </w:p>
+        </w:tc>
+        <w:tc>
+          <w:tcPr>
+            <w:tcW w:type="dxa" w:w="0"/>
+            <w:shd w:fill="FFFFFF" w:val="clear"/>
+            <w:tcMar>
+              <w:top w:type="dxa" w:w="80"/>
+              <w:left w:type="dxa" w:w="100"/>
+              <w:bottom w:type="dxa" w:w="80"/>
+              <w:right w:type="dxa" w:w="100"/>
+            </w:tcMar>
+          </w:tcPr>
+          <w:p>
+            <w:r>
+              <w:rPr>
+                <w:b w:val="false"/>
+                <w:bCs w:val="false"/>
+                <w:color w:val="222222"/>
+                <w:sz w:val="19"/>
+                <w:szCs w:val="19"/>
+              </w:rPr>
+              <w:t xml:space="preserve">Platform computes the disclosure-facing annual value from monthly entries (sum/latest/average/count depending on indicator type) — no manual totalling by the user</w:t>
             </w:r>
           </w:p>
         </w:tc>
@@ -2132,31 +2132,31 @@
                 <w:sz w:val="19"/>
                 <w:szCs w:val="19"/>
               </w:rPr>
-              <w:t xml:space="preserve">Target vs. actual tracking</w:t>
-            </w:r>
-          </w:p>
-        </w:tc>
-        <w:tc>
-          <w:tcPr>
-            <w:tcW w:type="dxa" w:w="0"/>
-            <w:shd w:fill="FFFFFF" w:val="clear"/>
-            <w:tcMar>
-              <w:top w:type="dxa" w:w="80"/>
-              <w:left w:type="dxa" w:w="100"/>
-              <w:bottom w:type="dxa" w:w="80"/>
-              <w:right w:type="dxa" w:w="100"/>
-            </w:tcMar>
-          </w:tcPr>
-          <w:p>
-            <w:r>
-              <w:rPr>
-                <w:b w:val="false"/>
-                <w:bCs w:val="false"/>
-                <w:color w:val="222222"/>
-                <w:sz w:val="19"/>
-                <w:szCs w:val="19"/>
-              </w:rPr>
-              <w:t xml:space="preserve">Set performance targets per indicator and compare against actuals over time</w:t>
+              <w:t xml:space="preserve">Common indicator forms</w:t>
+            </w:r>
+          </w:p>
+        </w:tc>
+        <w:tc>
+          <w:tcPr>
+            <w:tcW w:type="dxa" w:w="0"/>
+            <w:shd w:fill="FFFFFF" w:val="clear"/>
+            <w:tcMar>
+              <w:top w:type="dxa" w:w="80"/>
+              <w:left w:type="dxa" w:w="100"/>
+              <w:bottom w:type="dxa" w:w="80"/>
+              <w:right w:type="dxa" w:w="100"/>
+            </w:tcMar>
+          </w:tcPr>
+          <w:p>
+            <w:r>
+              <w:rPr>
+                <w:b w:val="false"/>
+                <w:bCs w:val="false"/>
+                <w:color w:val="222222"/>
+                <w:sz w:val="19"/>
+                <w:szCs w:val="19"/>
+              </w:rPr>
+              <w:t xml:space="preserve">Structured input for all applicable matters per plan and market classification</w:t>
             </w:r>
           </w:p>
         </w:tc>
@@ -2206,55 +2206,55 @@
                 <w:sz w:val="19"/>
                 <w:szCs w:val="19"/>
               </w:rPr>
-              <w:t xml:space="preserve">Pilot sector-specific [S] indicators</w:t>
-            </w:r>
-          </w:p>
-        </w:tc>
-        <w:tc>
-          <w:tcPr>
-            <w:tcW w:type="dxa" w:w="0"/>
-            <w:shd w:fill="FFFFFF" w:val="clear"/>
-            <w:tcMar>
-              <w:top w:type="dxa" w:w="80"/>
-              <w:left w:type="dxa" w:w="100"/>
-              <w:bottom w:type="dxa" w:w="80"/>
-              <w:right w:type="dxa" w:w="100"/>
-            </w:tcMar>
-          </w:tcPr>
-          <w:p>
-            <w:r>
-              <w:rPr>
-                <w:b w:val="false"/>
-                <w:bCs w:val="false"/>
-                <w:color w:val="222222"/>
-                <w:sz w:val="19"/>
-                <w:szCs w:val="19"/>
-              </w:rPr>
-              <w:t xml:space="preserve">One pilot sector module (e.g. Manufacturing) with additional relevant indicators</w:t>
-            </w:r>
-          </w:p>
-        </w:tc>
-        <w:tc>
-          <w:tcPr>
-            <w:tcW w:type="dxa" w:w="0"/>
-            <w:shd w:fill="FFFFFF" w:val="clear"/>
-            <w:tcMar>
-              <w:top w:type="dxa" w:w="80"/>
-              <w:left w:type="dxa" w:w="100"/>
-              <w:bottom w:type="dxa" w:w="80"/>
-              <w:right w:type="dxa" w:w="100"/>
-            </w:tcMar>
-          </w:tcPr>
-          <w:p>
-            <w:r>
-              <w:rPr>
-                <w:b w:val="false"/>
-                <w:bCs w:val="false"/>
-                <w:color w:val="222222"/>
-                <w:sz w:val="19"/>
-                <w:szCs w:val="19"/>
-              </w:rPr>
-              <w:t xml:space="preserve">Should</w:t>
+              <w:t xml:space="preserve">Multi-year data table</w:t>
+            </w:r>
+          </w:p>
+        </w:tc>
+        <w:tc>
+          <w:tcPr>
+            <w:tcW w:type="dxa" w:w="0"/>
+            <w:shd w:fill="FFFFFF" w:val="clear"/>
+            <w:tcMar>
+              <w:top w:type="dxa" w:w="80"/>
+              <w:left w:type="dxa" w:w="100"/>
+              <w:bottom w:type="dxa" w:w="80"/>
+              <w:right w:type="dxa" w:w="100"/>
+            </w:tcMar>
+          </w:tcPr>
+          <w:p>
+            <w:r>
+              <w:rPr>
+                <w:b w:val="false"/>
+                <w:bCs w:val="false"/>
+                <w:color w:val="222222"/>
+                <w:sz w:val="19"/>
+                <w:szCs w:val="19"/>
+              </w:rPr>
+              <w:t xml:space="preserve">Store and display at least 3 financial years per indicator, per Bursa's rolling 3-year requirement</w:t>
+            </w:r>
+          </w:p>
+        </w:tc>
+        <w:tc>
+          <w:tcPr>
+            <w:tcW w:type="dxa" w:w="0"/>
+            <w:shd w:fill="FFFFFF" w:val="clear"/>
+            <w:tcMar>
+              <w:top w:type="dxa" w:w="80"/>
+              <w:left w:type="dxa" w:w="100"/>
+              <w:bottom w:type="dxa" w:w="80"/>
+              <w:right w:type="dxa" w:w="100"/>
+            </w:tcMar>
+          </w:tcPr>
+          <w:p>
+            <w:r>
+              <w:rPr>
+                <w:b w:val="false"/>
+                <w:bCs w:val="false"/>
+                <w:color w:val="222222"/>
+                <w:sz w:val="19"/>
+                <w:szCs w:val="19"/>
+              </w:rPr>
+              <w:t xml:space="preserve">Must</w:t>
             </w:r>
           </w:p>
         </w:tc>
@@ -2280,31 +2280,179 @@
                 <w:sz w:val="19"/>
                 <w:szCs w:val="19"/>
               </w:rPr>
-              <w:t xml:space="preserve">Data source / audit trail</w:t>
-            </w:r>
-          </w:p>
-        </w:tc>
-        <w:tc>
-          <w:tcPr>
-            <w:tcW w:type="dxa" w:w="0"/>
-            <w:shd w:fill="FFFFFF" w:val="clear"/>
-            <w:tcMar>
-              <w:top w:type="dxa" w:w="80"/>
-              <w:left w:type="dxa" w:w="100"/>
-              <w:bottom w:type="dxa" w:w="80"/>
-              <w:right w:type="dxa" w:w="100"/>
-            </w:tcMar>
-          </w:tcPr>
-          <w:p>
-            <w:r>
-              <w:rPr>
-                <w:b w:val="false"/>
-                <w:bCs w:val="false"/>
-                <w:color w:val="222222"/>
-                <w:sz w:val="19"/>
-                <w:szCs w:val="19"/>
-              </w:rPr>
-              <w:t xml:space="preserve">Log who entered each data point, when, and optional source document reference</w:t>
+              <w:t xml:space="preserve">Target vs. actual tracking</w:t>
+            </w:r>
+          </w:p>
+        </w:tc>
+        <w:tc>
+          <w:tcPr>
+            <w:tcW w:type="dxa" w:w="0"/>
+            <w:shd w:fill="FFFFFF" w:val="clear"/>
+            <w:tcMar>
+              <w:top w:type="dxa" w:w="80"/>
+              <w:left w:type="dxa" w:w="100"/>
+              <w:bottom w:type="dxa" w:w="80"/>
+              <w:right w:type="dxa" w:w="100"/>
+            </w:tcMar>
+          </w:tcPr>
+          <w:p>
+            <w:r>
+              <w:rPr>
+                <w:b w:val="false"/>
+                <w:bCs w:val="false"/>
+                <w:color w:val="222222"/>
+                <w:sz w:val="19"/>
+                <w:szCs w:val="19"/>
+              </w:rPr>
+              <w:t xml:space="preserve">Set performance targets per indicator and compare against the computed annual actual over time</w:t>
+            </w:r>
+          </w:p>
+        </w:tc>
+        <w:tc>
+          <w:tcPr>
+            <w:tcW w:type="dxa" w:w="0"/>
+            <w:shd w:fill="FFFFFF" w:val="clear"/>
+            <w:tcMar>
+              <w:top w:type="dxa" w:w="80"/>
+              <w:left w:type="dxa" w:w="100"/>
+              <w:bottom w:type="dxa" w:w="80"/>
+              <w:right w:type="dxa" w:w="100"/>
+            </w:tcMar>
+          </w:tcPr>
+          <w:p>
+            <w:r>
+              <w:rPr>
+                <w:b w:val="false"/>
+                <w:bCs w:val="false"/>
+                <w:color w:val="222222"/>
+                <w:sz w:val="19"/>
+                <w:szCs w:val="19"/>
+              </w:rPr>
+              <w:t xml:space="preserve">Must</w:t>
+            </w:r>
+          </w:p>
+        </w:tc>
+      </w:tr>
+      <w:tr>
+        <w:tc>
+          <w:tcPr>
+            <w:tcW w:type="dxa" w:w="0"/>
+            <w:shd w:fill="FFFFFF" w:val="clear"/>
+            <w:tcMar>
+              <w:top w:type="dxa" w:w="80"/>
+              <w:left w:type="dxa" w:w="100"/>
+              <w:bottom w:type="dxa" w:w="80"/>
+              <w:right w:type="dxa" w:w="100"/>
+            </w:tcMar>
+          </w:tcPr>
+          <w:p>
+            <w:r>
+              <w:rPr>
+                <w:b w:val="false"/>
+                <w:bCs w:val="false"/>
+                <w:color w:val="222222"/>
+                <w:sz w:val="19"/>
+                <w:szCs w:val="19"/>
+              </w:rPr>
+              <w:t xml:space="preserve">Pilot sector-specific [S] indicators</w:t>
+            </w:r>
+          </w:p>
+        </w:tc>
+        <w:tc>
+          <w:tcPr>
+            <w:tcW w:type="dxa" w:w="0"/>
+            <w:shd w:fill="FFFFFF" w:val="clear"/>
+            <w:tcMar>
+              <w:top w:type="dxa" w:w="80"/>
+              <w:left w:type="dxa" w:w="100"/>
+              <w:bottom w:type="dxa" w:w="80"/>
+              <w:right w:type="dxa" w:w="100"/>
+            </w:tcMar>
+          </w:tcPr>
+          <w:p>
+            <w:r>
+              <w:rPr>
+                <w:b w:val="false"/>
+                <w:bCs w:val="false"/>
+                <w:color w:val="222222"/>
+                <w:sz w:val="19"/>
+                <w:szCs w:val="19"/>
+              </w:rPr>
+              <w:t xml:space="preserve">One pilot sector module (e.g. Manufacturing) with additional relevant indicators</w:t>
+            </w:r>
+          </w:p>
+        </w:tc>
+        <w:tc>
+          <w:tcPr>
+            <w:tcW w:type="dxa" w:w="0"/>
+            <w:shd w:fill="FFFFFF" w:val="clear"/>
+            <w:tcMar>
+              <w:top w:type="dxa" w:w="80"/>
+              <w:left w:type="dxa" w:w="100"/>
+              <w:bottom w:type="dxa" w:w="80"/>
+              <w:right w:type="dxa" w:w="100"/>
+            </w:tcMar>
+          </w:tcPr>
+          <w:p>
+            <w:r>
+              <w:rPr>
+                <w:b w:val="false"/>
+                <w:bCs w:val="false"/>
+                <w:color w:val="222222"/>
+                <w:sz w:val="19"/>
+                <w:szCs w:val="19"/>
+              </w:rPr>
+              <w:t xml:space="preserve">Should</w:t>
+            </w:r>
+          </w:p>
+        </w:tc>
+      </w:tr>
+      <w:tr>
+        <w:tc>
+          <w:tcPr>
+            <w:tcW w:type="dxa" w:w="0"/>
+            <w:shd w:fill="FFFFFF" w:val="clear"/>
+            <w:tcMar>
+              <w:top w:type="dxa" w:w="80"/>
+              <w:left w:type="dxa" w:w="100"/>
+              <w:bottom w:type="dxa" w:w="80"/>
+              <w:right w:type="dxa" w:w="100"/>
+            </w:tcMar>
+          </w:tcPr>
+          <w:p>
+            <w:r>
+              <w:rPr>
+                <w:b w:val="false"/>
+                <w:bCs w:val="false"/>
+                <w:color w:val="222222"/>
+                <w:sz w:val="19"/>
+                <w:szCs w:val="19"/>
+              </w:rPr>
+              <w:t xml:space="preserve">Monthly drill-down / audit trail</w:t>
+            </w:r>
+          </w:p>
+        </w:tc>
+        <w:tc>
+          <w:tcPr>
+            <w:tcW w:type="dxa" w:w="0"/>
+            <w:shd w:fill="FFFFFF" w:val="clear"/>
+            <w:tcMar>
+              <w:top w:type="dxa" w:w="80"/>
+              <w:left w:type="dxa" w:w="100"/>
+              <w:bottom w:type="dxa" w:w="80"/>
+              <w:right w:type="dxa" w:w="100"/>
+            </w:tcMar>
+          </w:tcPr>
+          <w:p>
+            <w:r>
+              <w:rPr>
+                <w:b w:val="false"/>
+                <w:bCs w:val="false"/>
+                <w:color w:val="222222"/>
+                <w:sz w:val="19"/>
+                <w:szCs w:val="19"/>
+              </w:rPr>
+              <w:t xml:space="preserve">View the underlying monthly entries behind any computed annual figure, with entry source and timestamp</w:t>
             </w:r>
           </w:p>
         </w:tc>

</xml_diff>